<commit_message>
docs(writing-audit): #8 + word counter fixed; fragment lint moved to TBD (D)
Co-Authored-By: Claude Opus 5.5 <noreply@anthropic.com>
</commit_message>
<xml_diff>
--- a/QC_report/writing-audit.docx
+++ b/QC_report/writing-audit.docx
@@ -472,45 +472,6 @@
           <w:b/>
           <w:bCs/>
         </w:rPr>
-        <w:t xml:space="preserve">#8 For instance / As a result are used but never taught</w:t>
-      </w:r>
-      <w:r>
-        <w:t xml:space="preserve"> - for-example, word-count - S</w:t>
-      </w:r>
-    </w:p>
-    <w:p>
-      <w:pPr>
-        <w:pStyle w:val="ListParagraph"/>
-        <w:numPr>
-          <w:ilvl w:val="0"/>
-          <w:numId w:val="2"/>
-        </w:numPr>
-      </w:pPr>
-      <w:r>
-        <w:t xml:space="preserve">Impact: the 6-sentence frame (word-count, topic lessons) asks for "For instance" and "As a result". A weak student meets both for the first time inside a template and either copies them blindly or freezes.</w:t>
-      </w:r>
-    </w:p>
-    <w:p>
-      <w:pPr>
-        <w:pStyle w:val="ListParagraph"/>
-        <w:numPr>
-          <w:ilvl w:val="0"/>
-          <w:numId w:val="2"/>
-        </w:numPr>
-      </w:pPr>
-      <w:r>
-        <w:t xml:space="preserve">Fix: in for-example, one preface line + one fill-in: "For instance = another For example (use it for the second reason, so you don't repeat For example). As a result = what happens because of this." Example item: *Teenagers who work learn the value of money. ___, they stop asking their parents for money for small things.* (As a result / For instance / In addition).</w:t>
-      </w:r>
-    </w:p>
-    <w:p>
-      <w:pPr>
-        <w:spacing w:after="120"/>
-      </w:pPr>
-      <w:r>
-        <w:rPr>
-          <w:b/>
-          <w:bCs/>
-        </w:rPr>
         <w:t xml:space="preserve">#9 word-count teaches the rules but never counting</w:t>
       </w:r>
       <w:r>
@@ -539,45 +500,6 @@
       </w:pPr>
       <w:r>
         <w:t xml:space="preserve">Fix: one MCQ with a short paragraph: "How many words? 58 / 68 / 78", then "This text has 62 words. Which sentence would you add?" (a For instance detail vs. "It is very very important." vs. copying the question).</w:t>
-      </w:r>
-    </w:p>
-    <w:p>
-      <w:pPr>
-        <w:spacing w:after="120"/>
-      </w:pPr>
-      <w:r>
-        <w:rPr>
-          <w:b/>
-          <w:bCs/>
-        </w:rPr>
-        <w:t xml:space="preserve">#10 Fragments are only caught in subject-verb</w:t>
-      </w:r>
-      <w:r>
-        <w:t xml:space="preserve"> - lint, all writing tasks - S</w:t>
-      </w:r>
-    </w:p>
-    <w:p>
-      <w:pPr>
-        <w:pStyle w:val="ListParagraph"/>
-        <w:numPr>
-          <w:ilvl w:val="0"/>
-          <w:numId w:val="2"/>
-        </w:numPr>
-      </w:pPr>
-      <w:r>
-        <w:t xml:space="preserve">Impact: "Because it helps people." (no main clause) appears from the because lesson onward; the automatic check doesn't flag it, so the habit forms before subject-verb.</w:t>
-      </w:r>
-    </w:p>
-    <w:p>
-      <w:pPr>
-        <w:pStyle w:val="ListParagraph"/>
-        <w:numPr>
-          <w:ilvl w:val="0"/>
-          <w:numId w:val="2"/>
-        </w:numPr>
-      </w:pPr>
-      <w:r>
-        <w:t xml:space="preserve">Fix: the lint flags a sentence that starts with "Because" and has no comma-separated main clause, or has no verb from a short list (is / are / was / have / can / should / any word ending in -s / -ed). Message: "משפט N: Because לבד הוא חצי משפט. חברו אותו למשפט הקודם: I think X because..."</w:t>
       </w:r>
     </w:p>
     <w:p>
@@ -979,6 +901,45 @@
     </w:p>
     <w:p>
       <w:pPr>
+        <w:spacing w:after="120"/>
+      </w:pPr>
+      <w:r>
+        <w:rPr>
+          <w:b/>
+          <w:bCs/>
+        </w:rPr>
+        <w:t xml:space="preserve">D. Fragment check in the lint</w:t>
+      </w:r>
+      <w:r>
+        <w:t xml:space="preserve"> (owner: TBD, 2026-10-10) - S</w:t>
+      </w:r>
+    </w:p>
+    <w:p>
+      <w:pPr>
+        <w:pStyle w:val="ListParagraph"/>
+        <w:numPr>
+          <w:ilvl w:val="0"/>
+          <w:numId w:val="2"/>
+        </w:numPr>
+      </w:pPr>
+      <w:r>
+        <w:t xml:space="preserve">Impact: "Because it helps people." (no main clause) appears from the because lesson onward; the automatic check doesn't flag it, so the habit forms before subject-verb.</w:t>
+      </w:r>
+    </w:p>
+    <w:p>
+      <w:pPr>
+        <w:pStyle w:val="ListParagraph"/>
+        <w:numPr>
+          <w:ilvl w:val="0"/>
+          <w:numId w:val="2"/>
+        </w:numPr>
+      </w:pPr>
+      <w:r>
+        <w:t xml:space="preserve">Fix: the lint flags a sentence that starts with "Because" and has no comma-separated main clause, or has no verb from a short list (is / are / was / have / can / should / any word ending in -s / -ed). Message: "משפט N: Because לבד הוא חצי משפט. חברו אותו למשפט הקודם: I think X because..."</w:t>
+      </w:r>
+    </w:p>
+    <w:p>
+      <w:pPr>
         <w:pStyle w:val="Heading2"/>
       </w:pPr>
       <w:r>
@@ -1018,7 +979,7 @@
         </w:numPr>
       </w:pPr>
       <w:r>
-        <w:t xml:space="preserve">#8, #9, #10, #11 (all S)</w:t>
+        <w:t xml:space="preserve">#9, #11 (both S)</w:t>
       </w:r>
     </w:p>
     <w:p>
@@ -1042,7 +1003,7 @@
         </w:numPr>
       </w:pPr>
       <w:r>
-        <w:t xml:space="preserve">A and B after the play-test shows where students stall</w:t>
+        <w:t xml:space="preserve">A, B, D after the play-test shows where students stall</w:t>
       </w:r>
     </w:p>
     <w:p>
@@ -2324,6 +2285,156 @@
           <w:p>
             <w:r>
               <w:t xml:space="preserve">9ae27cf</w:t>
+            </w:r>
+          </w:p>
+        </w:tc>
+      </w:tr>
+      <w:tr>
+        <w:trPr>
+          <w:tblHeader w:val="off"/>
+        </w:trPr>
+        <w:tc>
+          <w:tcPr>
+            <w:tcW w:type="dxa" w:w="3120"/>
+            <w:tcBorders>
+              <w:top w:val="single" w:color="BBBBBB" w:sz="4"/>
+              <w:left w:val="single" w:color="BBBBBB" w:sz="4"/>
+              <w:bottom w:val="single" w:color="BBBBBB" w:sz="4"/>
+              <w:right w:val="single" w:color="BBBBBB" w:sz="4"/>
+            </w:tcBorders>
+            <w:tcMar>
+              <w:top w:type="dxa" w:w="60"/>
+              <w:left w:type="dxa" w:w="100"/>
+              <w:bottom w:type="dxa" w:w="60"/>
+              <w:right w:type="dxa" w:w="100"/>
+            </w:tcMar>
+          </w:tcPr>
+          <w:p>
+            <w:r>
+              <w:t xml:space="preserve">#8 For instance / As a result untaught</w:t>
+            </w:r>
+          </w:p>
+        </w:tc>
+        <w:tc>
+          <w:tcPr>
+            <w:tcW w:type="dxa" w:w="3120"/>
+            <w:tcBorders>
+              <w:top w:val="single" w:color="BBBBBB" w:sz="4"/>
+              <w:left w:val="single" w:color="BBBBBB" w:sz="4"/>
+              <w:bottom w:val="single" w:color="BBBBBB" w:sz="4"/>
+              <w:right w:val="single" w:color="BBBBBB" w:sz="4"/>
+            </w:tcBorders>
+            <w:tcMar>
+              <w:top w:type="dxa" w:w="60"/>
+              <w:left w:type="dxa" w:w="100"/>
+              <w:bottom w:type="dxa" w:w="60"/>
+              <w:right w:type="dxa" w:w="100"/>
+            </w:tcMar>
+          </w:tcPr>
+          <w:p>
+            <w:r>
+              <w:t xml:space="preserve">preface card + summary line in for-example, an As a result fill-in (round 1), a For instance choice (round 2)</w:t>
+            </w:r>
+          </w:p>
+        </w:tc>
+        <w:tc>
+          <w:tcPr>
+            <w:tcW w:type="dxa" w:w="3120"/>
+            <w:tcBorders>
+              <w:top w:val="single" w:color="BBBBBB" w:sz="4"/>
+              <w:left w:val="single" w:color="BBBBBB" w:sz="4"/>
+              <w:bottom w:val="single" w:color="BBBBBB" w:sz="4"/>
+              <w:right w:val="single" w:color="BBBBBB" w:sz="4"/>
+            </w:tcBorders>
+            <w:tcMar>
+              <w:top w:type="dxa" w:w="60"/>
+              <w:left w:type="dxa" w:w="100"/>
+              <w:bottom w:type="dxa" w:w="60"/>
+              <w:right w:type="dxa" w:w="100"/>
+            </w:tcMar>
+          </w:tcPr>
+          <w:p>
+            <w:r>
+              <w:t xml:space="preserve">e2b2ac2</w:t>
+            </w:r>
+          </w:p>
+        </w:tc>
+      </w:tr>
+      <w:tr>
+        <w:trPr>
+          <w:tblHeader w:val="off"/>
+        </w:trPr>
+        <w:tc>
+          <w:tcPr>
+            <w:tcW w:type="dxa" w:w="3120"/>
+            <w:tcBorders>
+              <w:top w:val="single" w:color="BBBBBB" w:sz="4"/>
+              <w:left w:val="single" w:color="BBBBBB" w:sz="4"/>
+              <w:bottom w:val="single" w:color="BBBBBB" w:sz="4"/>
+              <w:right w:val="single" w:color="BBBBBB" w:sz="4"/>
+            </w:tcBorders>
+            <w:tcMar>
+              <w:top w:type="dxa" w:w="60"/>
+              <w:left w:type="dxa" w:w="100"/>
+              <w:bottom w:type="dxa" w:w="60"/>
+              <w:right w:type="dxa" w:w="100"/>
+            </w:tcMar>
+          </w:tcPr>
+          <w:p>
+            <w:r>
+              <w:t xml:space="preserve">word counter</w:t>
+            </w:r>
+          </w:p>
+        </w:tc>
+        <w:tc>
+          <w:tcPr>
+            <w:tcW w:type="dxa" w:w="3120"/>
+            <w:tcBorders>
+              <w:top w:val="single" w:color="BBBBBB" w:sz="4"/>
+              <w:left w:val="single" w:color="BBBBBB" w:sz="4"/>
+              <w:bottom w:val="single" w:color="BBBBBB" w:sz="4"/>
+              <w:right w:val="single" w:color="BBBBBB" w:sz="4"/>
+            </w:tcBorders>
+            <w:tcMar>
+              <w:top w:type="dxa" w:w="60"/>
+              <w:left w:type="dxa" w:w="100"/>
+              <w:bottom w:type="dxa" w:w="60"/>
+              <w:right w:type="dxa" w:w="100"/>
+            </w:tcMar>
+          </w:tcPr>
+          <w:p>
+            <w:r>
+              <w:rPr>
+                <w:rFonts w:ascii="Consolas" w:cs="Consolas" w:eastAsia="Consolas" w:hAnsi="Consolas"/>
+                <w:sz w:val="20"/>
+                <w:szCs w:val="20"/>
+              </w:rPr>
+              <w:t xml:space="preserve">wordCounter</w:t>
+            </w:r>
+            <w:r>
+              <w:t xml:space="preserve"> on line-mode tasks of 3+ sentences (10 tasks); paragraph mode already had one</w:t>
+            </w:r>
+          </w:p>
+        </w:tc>
+        <w:tc>
+          <w:tcPr>
+            <w:tcW w:type="dxa" w:w="3120"/>
+            <w:tcBorders>
+              <w:top w:val="single" w:color="BBBBBB" w:sz="4"/>
+              <w:left w:val="single" w:color="BBBBBB" w:sz="4"/>
+              <w:bottom w:val="single" w:color="BBBBBB" w:sz="4"/>
+              <w:right w:val="single" w:color="BBBBBB" w:sz="4"/>
+            </w:tcBorders>
+            <w:tcMar>
+              <w:top w:type="dxa" w:w="60"/>
+              <w:left w:type="dxa" w:w="100"/>
+              <w:bottom w:type="dxa" w:w="60"/>
+              <w:right w:type="dxa" w:w="100"/>
+            </w:tcMar>
+          </w:tcPr>
+          <w:p>
+            <w:r>
+              <w:t xml:space="preserve">2b2ca5c</w:t>
             </w:r>
           </w:p>
         </w:tc>

</xml_diff>

<commit_message>
content(c-3): subject-verb round 3 = required 4-sentence frame on a MIKUD topic, checked for subject + verb
Writing audit #3 follow-up, fix 2: the frame no longer goes cold for two lessons
between in-conclusion and topic-volunteer; it is now written 3 times (required)
before the first 70-90 paragraph. Replaces the optional 'any topic' free writing
(audit open #7).

Co-Authored-By: Claude Opus 5.5 <noreply@anthropic.com>
</commit_message>
<xml_diff>
--- a/QC_report/writing-audit.docx
+++ b/QC_report/writing-audit.docx
@@ -590,33 +590,6 @@
     </w:p>
     <w:p>
       <w:pPr>
-        <w:spacing w:after="120"/>
-      </w:pPr>
-      <w:r>
-        <w:rPr>
-          <w:b/>
-          <w:bCs/>
-        </w:rPr>
-        <w:t xml:space="preserve">#7 subject-verb free task is "any topic"</w:t>
-      </w:r>
-      <w:r>
-        <w:t xml:space="preserve"> - subject-verb optional round - S</w:t>
-      </w:r>
-    </w:p>
-    <w:p>
-      <w:pPr>
-        <w:pStyle w:val="ListParagraph"/>
-        <w:numPr>
-          <w:ilvl w:val="0"/>
-          <w:numId w:val="2"/>
-        </w:numPr>
-      </w:pPr>
-      <w:r>
-        <w:t xml:space="preserve">Fix: give it a MIKUD topic like the other tasks.</w:t>
-      </w:r>
-    </w:p>
-    <w:p>
-      <w:pPr>
         <w:pStyle w:val="Heading2"/>
       </w:pPr>
       <w:r>
@@ -1015,7 +988,7 @@
         </w:numPr>
       </w:pPr>
       <w:r>
-        <w:t xml:space="preserve">#4, #5, #7</w:t>
+        <w:t xml:space="preserve">#4, #5</w:t>
       </w:r>
     </w:p>
     <w:p>
@@ -2435,6 +2408,156 @@
           <w:p>
             <w:r>
               <w:t xml:space="preserve">2b2ca5c</w:t>
+            </w:r>
+          </w:p>
+        </w:tc>
+      </w:tr>
+      <w:tr>
+        <w:trPr>
+          <w:tblHeader w:val="off"/>
+        </w:trPr>
+        <w:tc>
+          <w:tcPr>
+            <w:tcW w:type="dxa" w:w="3120"/>
+            <w:tcBorders>
+              <w:top w:val="single" w:color="BBBBBB" w:sz="4"/>
+              <w:left w:val="single" w:color="BBBBBB" w:sz="4"/>
+              <w:bottom w:val="single" w:color="BBBBBB" w:sz="4"/>
+              <w:right w:val="single" w:color="BBBBBB" w:sz="4"/>
+            </w:tcBorders>
+            <w:tcMar>
+              <w:top w:type="dxa" w:w="60"/>
+              <w:left w:type="dxa" w:w="100"/>
+              <w:bottom w:type="dxa" w:w="60"/>
+              <w:right w:type="dxa" w:w="100"/>
+            </w:tcMar>
+          </w:tcPr>
+          <w:p>
+            <w:r>
+              <w:t xml:space="preserve">#3 follow-up: snowball enforced</w:t>
+            </w:r>
+          </w:p>
+        </w:tc>
+        <w:tc>
+          <w:tcPr>
+            <w:tcW w:type="dxa" w:w="3120"/>
+            <w:tcBorders>
+              <w:top w:val="single" w:color="BBBBBB" w:sz="4"/>
+              <w:left w:val="single" w:color="BBBBBB" w:sz="4"/>
+              <w:bottom w:val="single" w:color="BBBBBB" w:sz="4"/>
+              <w:right w:val="single" w:color="BBBBBB" w:sz="4"/>
+            </w:tcBorders>
+            <w:tcMar>
+              <w:top w:type="dxa" w:w="60"/>
+              <w:left w:type="dxa" w:w="100"/>
+              <w:bottom w:type="dxa" w:w="60"/>
+              <w:right w:type="dxa" w:w="100"/>
+            </w:tcMar>
+          </w:tcPr>
+          <w:p>
+            <w:r>
+              <w:rPr>
+                <w:rFonts w:ascii="Consolas" w:cs="Consolas" w:eastAsia="Consolas" w:hAnsi="Consolas"/>
+                <w:sz w:val="20"/>
+                <w:szCs w:val="20"/>
+              </w:rPr>
+              <w:t xml:space="preserve">requiredMoves</w:t>
+            </w:r>
+            <w:r>
+              <w:t xml:space="preserve"> on 28 tasks: a task fails if an earlier move (stance, because, In addition...) is missing; synonyms count</w:t>
+            </w:r>
+          </w:p>
+        </w:tc>
+        <w:tc>
+          <w:tcPr>
+            <w:tcW w:type="dxa" w:w="3120"/>
+            <w:tcBorders>
+              <w:top w:val="single" w:color="BBBBBB" w:sz="4"/>
+              <w:left w:val="single" w:color="BBBBBB" w:sz="4"/>
+              <w:bottom w:val="single" w:color="BBBBBB" w:sz="4"/>
+              <w:right w:val="single" w:color="BBBBBB" w:sz="4"/>
+            </w:tcBorders>
+            <w:tcMar>
+              <w:top w:type="dxa" w:w="60"/>
+              <w:left w:type="dxa" w:w="100"/>
+              <w:bottom w:type="dxa" w:w="60"/>
+              <w:right w:type="dxa" w:w="100"/>
+            </w:tcMar>
+          </w:tcPr>
+          <w:p>
+            <w:r>
+              <w:t xml:space="preserve">84dbdbf</w:t>
+            </w:r>
+          </w:p>
+        </w:tc>
+      </w:tr>
+      <w:tr>
+        <w:trPr>
+          <w:tblHeader w:val="off"/>
+        </w:trPr>
+        <w:tc>
+          <w:tcPr>
+            <w:tcW w:type="dxa" w:w="3120"/>
+            <w:tcBorders>
+              <w:top w:val="single" w:color="BBBBBB" w:sz="4"/>
+              <w:left w:val="single" w:color="BBBBBB" w:sz="4"/>
+              <w:bottom w:val="single" w:color="BBBBBB" w:sz="4"/>
+              <w:right w:val="single" w:color="BBBBBB" w:sz="4"/>
+            </w:tcBorders>
+            <w:tcMar>
+              <w:top w:type="dxa" w:w="60"/>
+              <w:left w:type="dxa" w:w="100"/>
+              <w:bottom w:type="dxa" w:w="60"/>
+              <w:right w:type="dxa" w:w="100"/>
+            </w:tcMar>
+          </w:tcPr>
+          <w:p>
+            <w:r>
+              <w:t xml:space="preserve">#3 follow-up: frame kept warm (and #7)</w:t>
+            </w:r>
+          </w:p>
+        </w:tc>
+        <w:tc>
+          <w:tcPr>
+            <w:tcW w:type="dxa" w:w="3120"/>
+            <w:tcBorders>
+              <w:top w:val="single" w:color="BBBBBB" w:sz="4"/>
+              <w:left w:val="single" w:color="BBBBBB" w:sz="4"/>
+              <w:bottom w:val="single" w:color="BBBBBB" w:sz="4"/>
+              <w:right w:val="single" w:color="BBBBBB" w:sz="4"/>
+            </w:tcBorders>
+            <w:tcMar>
+              <w:top w:type="dxa" w:w="60"/>
+              <w:left w:type="dxa" w:w="100"/>
+              <w:bottom w:type="dxa" w:w="60"/>
+              <w:right w:type="dxa" w:w="100"/>
+            </w:tcMar>
+          </w:tcPr>
+          <w:p>
+            <w:r>
+              <w:t xml:space="preserve">subject-verb round 3 = required 4-sentence frame on MIKUD topic 18, checked for subject + verb; frame written 3 times before the first paragraph</w:t>
+            </w:r>
+          </w:p>
+        </w:tc>
+        <w:tc>
+          <w:tcPr>
+            <w:tcW w:type="dxa" w:w="3120"/>
+            <w:tcBorders>
+              <w:top w:val="single" w:color="BBBBBB" w:sz="4"/>
+              <w:left w:val="single" w:color="BBBBBB" w:sz="4"/>
+              <w:bottom w:val="single" w:color="BBBBBB" w:sz="4"/>
+              <w:right w:val="single" w:color="BBBBBB" w:sz="4"/>
+            </w:tcBorders>
+            <w:tcMar>
+              <w:top w:type="dxa" w:w="60"/>
+              <w:left w:type="dxa" w:w="100"/>
+              <w:bottom w:type="dxa" w:w="60"/>
+              <w:right w:type="dxa" w:w="100"/>
+            </w:tcMar>
+          </w:tcPr>
+          <w:p>
+            <w:r>
+              <w:t xml:space="preserve">see git log</w:t>
             </w:r>
           </w:p>
         </w:tc>

</xml_diff>